<commit_message>
Regenerate the GEDI analysis tables without the retired Option A layer
The follow-up promised in 0efb56a. The analysis tables and the three
shared figures were carrying rows and a series from the run that
verified the --legacy-option-a path still works; these are rebuilt from
the default, Option-A-free run.

layer_ratio_in_region.csv and layer_ratio_by_region.csv are removed
from the default outputs: they compare baseline_M against New_M_2019
and now exist only when Step_05 is run with --legacy-option-a, which
is what the older present-day report needs. That report is committed
here as regenerated by that path, so it stays reproducible.

Co-Authored-By: Claude Opus 5 (1M context) <noreply@anthropic.com>
</commit_message>
<xml_diff>
--- a/Validation_GEDI/Validation_GEDI_future_M_report.docx
+++ b/Validation_GEDI/Validation_GEDI_future_M_report.docx
@@ -281,7 +281,7 @@
     <w:p/>
     <w:p>
       <w:r>
-        <w:t>Every number below is computed on the fire-excluded cells, which drop any footprint whose cell burned within the recovery window before acquisition. The all-footprints version is in outputs/analysis/overall_by_layer.csv and moves the exceedance rates by one to two percentage points, never the conclusions.</w:t>
+        <w:t>Every number below is computed on the fire-excluded cells, which drop any footprint whose cell burned within the recovery window before acquisition. The all-footprints version is in outputs/analysis/overall_by_layer.csv and raises every exceedance rate by 1.9 to 2.2 percentage points, never changing the conclusions.</w:t>
       </w:r>
     </w:p>
     <w:p>
@@ -1012,7 +1012,7 @@
       <w:r>
         <w:drawing>
           <wp:inline xmlns:a="http://schemas.openxmlformats.org/drawingml/2006/main" xmlns:pic="http://schemas.openxmlformats.org/drawingml/2006/picture">
-            <wp:extent cx="5760720" cy="2971415"/>
+            <wp:extent cx="5760720" cy="2976119"/>
             <wp:docPr id="1" name="Picture 1"/>
             <wp:cNvGraphicFramePr>
               <a:graphicFrameLocks noChangeAspect="1"/>
@@ -1033,7 +1033,7 @@
                   <pic:spPr>
                     <a:xfrm>
                       <a:off x="0" y="0"/>
-                      <a:ext cx="5760720" cy="2971415"/>
+                      <a:ext cx="5760720" cy="2976119"/>
                     </a:xfrm>
                     <a:prstGeom prst="rect"/>
                   </pic:spPr>

</xml_diff>